<commit_message>
docs: data model / FDS / OIR / ERD / project-status updates
</commit_message>
<xml_diff>
--- a/MPP_MES_FDS.docx
+++ b/MPP_MES_FDS.docx
@@ -90,7 +90,7 @@
         <w:t xml:space="preserve"> </w:t>
       </w:r>
       <w:r>
-        <w:t xml:space="preserve">1.1 — Customer Review Release</w:t>
+        <w:t xml:space="preserve">1.3 — Customer Review Release</w:t>
       </w:r>
       <w:r>
         <w:t xml:space="preserve"> </w:t>
@@ -106,7 +106,7 @@
         <w:t xml:space="preserve"> </w:t>
       </w:r>
       <w:r>
-        <w:t xml:space="preserve">2026-05-12</w:t>
+        <w:t xml:space="preserve">2026-06-03</w:t>
       </w:r>
     </w:p>
     <w:p>

</xml_diff>

<commit_message>
docs(fds): v1.4 follow-ups - architecture diagram annotation + LOT-move step re-anchored to view-policy
</commit_message>
<xml_diff>
--- a/MPP_MES_FDS.docx
+++ b/MPP_MES_FDS.docx
@@ -5423,7 +5423,7 @@
         <w:rPr>
           <w:rStyle w:val="VerbatimChar"/>
         </w:rPr>
-        <w:t xml:space="preserve">│    │DC   │ │Trim │ │Mach│ │Assy  │  Shared terminals            │</w:t>
+        <w:t xml:space="preserve">│    │DC   │ │Trim │ │Mach│ │Assy  │  Operator terminals          │</w:t>
       </w:r>
       <w:r>
         <w:br/>
@@ -5432,7 +5432,7 @@
         <w:rPr>
           <w:rStyle w:val="VerbatimChar"/>
         </w:rPr>
-        <w:t xml:space="preserve">│    │Terms│ │Terms│ │Terms│ │Terms │  (fewer than machines;       │</w:t>
+        <w:t xml:space="preserve">│    │Terms│ │Terms│ │Terms│ │Terms │  (view-policy, FDS-02-010;   │</w:t>
       </w:r>
       <w:r>
         <w:br/>
@@ -5441,7 +5441,7 @@
         <w:rPr>
           <w:rStyle w:val="VerbatimChar"/>
         </w:rPr>
-        <w:t xml:space="preserve">│    └──┬──┘ └──┬──┘ └──┬─┘ └──┬───┘   machine resolved by scan)  │</w:t>
+        <w:t xml:space="preserve">│    └──┬──┘ └──┬──┘ └──┬─┘ └──┬───┘   DC shared; rest dedicated) │</w:t>
       </w:r>
       <w:r>
         <w:br/>
@@ -21226,13 +21226,13 @@
           <w:b/>
           <w:bCs/>
         </w:rPr>
-        <w:t xml:space="preserve">Set destination Cell</w:t>
-      </w:r>
-      <w:r>
-        <w:t xml:space="preserve"> </w:t>
-      </w:r>
-      <w:r>
-        <w:t xml:space="preserve">— On a dedicated terminal the destination defaults to the terminal’s parent Cell (FDS-02-009) and is read-only. On a shared terminal the operator selects the destination Cell by scan or dropdown (constrained to descendant Cells of the terminal’s parent Location). Either path resolves to a</w:t>
+        <w:t xml:space="preserve">Set destination</w:t>
+      </w:r>
+      <w:r>
+        <w:t xml:space="preserve"> </w:t>
+      </w:r>
+      <w:r>
+        <w:t xml:space="preserve">— On a dedicated terminal the destination defaults to the terminal’s parent Location (a Cell, Line, or Area per FDS-02-009) and is read-only. On a shared terminal the operator selects the destination Cell by scan or dropdown (constrained to descendant equipment Cells of the terminal’s parent Location). Either path resolves to a</w:t>
       </w:r>
       <w:r>
         <w:t xml:space="preserve"> </w:t>
@@ -21247,7 +21247,7 @@
         <w:t xml:space="preserve"> </w:t>
       </w:r>
       <w:r>
-        <w:t xml:space="preserve">and SHALL verify the destination is a valid production context (Cell-tier, appropriate definition).</w:t>
+        <w:t xml:space="preserve">and SHALL verify the destination is a valid production context (a Cell-tier Location — or, on line/area-resolution terminals, the line/area itself per FDS-02-009 — with an appropriate definition).</w:t>
       </w:r>
     </w:p>
     <w:p>

</xml_diff>

<commit_message>
docs: regenerate FDS + OIR docx after the cross-reference corrections
</commit_message>
<xml_diff>
--- a/MPP_MES_FDS.docx
+++ b/MPP_MES_FDS.docx
@@ -428,11 +428,141 @@
               <w:pStyle w:val="Compact"/>
             </w:pPr>
             <w:r>
+              <w:t xml:space="preserve">1.7a</w:t>
+            </w:r>
+          </w:p>
+        </w:tc>
+        <w:tc>
+          <w:tcPr/>
+          <w:p>
+            <w:pPr>
+              <w:pStyle w:val="Compact"/>
+            </w:pPr>
+            <w:r>
+              <w:t xml:space="preserve">2026-08-25</w:t>
+            </w:r>
+          </w:p>
+        </w:tc>
+        <w:tc>
+          <w:tcPr/>
+          <w:p>
+            <w:pPr>
+              <w:pStyle w:val="Compact"/>
+            </w:pPr>
+            <w:r>
+              <w:t xml:space="preserve">Blue Ridge Automation</w:t>
+            </w:r>
+          </w:p>
+        </w:tc>
+        <w:tc>
+          <w:tcPr/>
+          <w:p>
+            <w:pPr>
+              <w:pStyle w:val="Compact"/>
+            </w:pPr>
+            <w:r>
+              <w:rPr>
+                <w:b/>
+                <w:bCs/>
+              </w:rPr>
+              <w:t xml:space="preserve">Correction — dangling cross-reference in §5.4.</w:t>
+            </w:r>
+            <w:r>
+              <w:t xml:space="preserve"> </w:t>
+            </w:r>
+            <w:r>
+              <w:t xml:space="preserve">The sublot-permanence requirement cited</w:t>
+            </w:r>
+            <w:r>
+              <w:t xml:space="preserve"> </w:t>
+            </w:r>
+            <w:r>
+              <w:t xml:space="preserve">“per-cavity sublots (</w:t>
+            </w:r>
+            <w:r>
+              <w:rPr>
+                <w:rStyle w:val="VerbatimChar"/>
+              </w:rPr>
+              <w:t xml:space="preserve">FDS-05-023</w:t>
+            </w:r>
+            <w:r>
+              <w:t xml:space="preserve">)”</w:t>
+            </w:r>
+            <w:r>
+              <w:t xml:space="preserve">, but</w:t>
+            </w:r>
+            <w:r>
+              <w:t xml:space="preserve"> </w:t>
+            </w:r>
+            <w:r>
+              <w:rPr>
+                <w:rStyle w:val="VerbatimChar"/>
+              </w:rPr>
+              <w:t xml:space="preserve">FDS-05-023</w:t>
+            </w:r>
+            <w:r>
+              <w:t xml:space="preserve"> </w:t>
+            </w:r>
+            <w:r>
+              <w:t xml:space="preserve">(</w:t>
+            </w:r>
+            <w:r>
+              <w:t xml:space="preserve">“Per-Cavity Sublots at Die Cast”</w:t>
+            </w:r>
+            <w:r>
+              <w:t xml:space="preserve">, added v0.9) had its heading removed in the v0.11m renumbering pass while this one citation was left behind — it has pointed at a non-existent requirement ever since, and rendered as a broken link in the docs portal. The reference is</w:t>
+            </w:r>
+            <w:r>
+              <w:t xml:space="preserve"> </w:t>
+            </w:r>
+            <w:r>
+              <w:rPr>
+                <w:b/>
+                <w:bCs/>
+              </w:rPr>
+              <w:t xml:space="preserve">removed rather than repointed</w:t>
+            </w:r>
+            <w:r>
+              <w:t xml:space="preserve">: the concept it described (one parent LOT per die run with one child sublot per cavity) was superseded by the 2026-07-29 per-cavity lifecycle, in which each cavity accumulates its own</w:t>
+            </w:r>
+            <w:r>
+              <w:t xml:space="preserve"> </w:t>
+            </w:r>
+            <w:r>
+              <w:rPr>
+                <w:b/>
+                <w:bCs/>
+              </w:rPr>
+              <w:t xml:space="preserve">independent</w:t>
+            </w:r>
+            <w:r>
+              <w:t xml:space="preserve"> </w:t>
+            </w:r>
+            <w:r>
+              <w:t xml:space="preserve">LOT (FDS-05-039) with no parent, so Die Cast creates no parent→child genealogy edge at all. Text-only correction; no requirement added, removed, or renumbered.</w:t>
+            </w:r>
+          </w:p>
+        </w:tc>
+      </w:tr>
+      <w:tr>
+        <w:tc>
+          <w:tcPr>
+            <w:shd w:val="clear" w:color="auto" w:fill="F2F2F2"/>
+          </w:tcPr>
+          <w:tcPr/>
+          <w:p>
+            <w:pPr>
+              <w:pStyle w:val="Compact"/>
+            </w:pPr>
+            <w:r>
               <w:t xml:space="preserve">1.7</w:t>
             </w:r>
           </w:p>
         </w:tc>
         <w:tc>
+          <w:tcPr>
+            <w:shd w:val="clear" w:color="auto" w:fill="F2F2F2"/>
+          </w:tcPr>
           <w:tcPr/>
           <w:p>
             <w:pPr>
@@ -444,6 +574,9 @@
           </w:p>
         </w:tc>
         <w:tc>
+          <w:tcPr>
+            <w:shd w:val="clear" w:color="auto" w:fill="F2F2F2"/>
+          </w:tcPr>
           <w:tcPr/>
           <w:p>
             <w:pPr>
@@ -455,6 +588,9 @@
           </w:p>
         </w:tc>
         <w:tc>
+          <w:tcPr>
+            <w:shd w:val="clear" w:color="auto" w:fill="F2F2F2"/>
+          </w:tcPr>
           <w:tcPr/>
           <w:p>
             <w:pPr>
@@ -971,9 +1107,6 @@
       </w:tr>
       <w:tr>
         <w:tc>
-          <w:tcPr>
-            <w:shd w:val="clear" w:color="auto" w:fill="F2F2F2"/>
-          </w:tcPr>
           <w:tcPr/>
           <w:p>
             <w:pPr>
@@ -985,9 +1118,6 @@
           </w:p>
         </w:tc>
         <w:tc>
-          <w:tcPr>
-            <w:shd w:val="clear" w:color="auto" w:fill="F2F2F2"/>
-          </w:tcPr>
           <w:tcPr/>
           <w:p>
             <w:pPr>
@@ -999,9 +1129,6 @@
           </w:p>
         </w:tc>
         <w:tc>
-          <w:tcPr>
-            <w:shd w:val="clear" w:color="auto" w:fill="F2F2F2"/>
-          </w:tcPr>
           <w:tcPr/>
           <w:p>
             <w:pPr>
@@ -1013,9 +1140,6 @@
           </w:p>
         </w:tc>
         <w:tc>
-          <w:tcPr>
-            <w:shd w:val="clear" w:color="auto" w:fill="F2F2F2"/>
-          </w:tcPr>
           <w:tcPr/>
           <w:p>
             <w:pPr>
@@ -1322,6 +1446,9 @@
       </w:tr>
       <w:tr>
         <w:tc>
+          <w:tcPr>
+            <w:shd w:val="clear" w:color="auto" w:fill="F2F2F2"/>
+          </w:tcPr>
           <w:tcPr/>
           <w:p>
             <w:pPr>
@@ -1333,6 +1460,9 @@
           </w:p>
         </w:tc>
         <w:tc>
+          <w:tcPr>
+            <w:shd w:val="clear" w:color="auto" w:fill="F2F2F2"/>
+          </w:tcPr>
           <w:tcPr/>
           <w:p>
             <w:pPr>
@@ -1344,6 +1474,9 @@
           </w:p>
         </w:tc>
         <w:tc>
+          <w:tcPr>
+            <w:shd w:val="clear" w:color="auto" w:fill="F2F2F2"/>
+          </w:tcPr>
           <w:tcPr/>
           <w:p>
             <w:pPr>
@@ -1355,6 +1488,9 @@
           </w:p>
         </w:tc>
         <w:tc>
+          <w:tcPr>
+            <w:shd w:val="clear" w:color="auto" w:fill="F2F2F2"/>
+          </w:tcPr>
           <w:tcPr/>
           <w:p>
             <w:pPr>
@@ -1600,9 +1736,6 @@
       </w:tr>
       <w:tr>
         <w:tc>
-          <w:tcPr>
-            <w:shd w:val="clear" w:color="auto" w:fill="F2F2F2"/>
-          </w:tcPr>
           <w:tcPr/>
           <w:p>
             <w:pPr>
@@ -1614,9 +1747,6 @@
           </w:p>
         </w:tc>
         <w:tc>
-          <w:tcPr>
-            <w:shd w:val="clear" w:color="auto" w:fill="F2F2F2"/>
-          </w:tcPr>
           <w:tcPr/>
           <w:p>
             <w:pPr>
@@ -1628,9 +1758,6 @@
           </w:p>
         </w:tc>
         <w:tc>
-          <w:tcPr>
-            <w:shd w:val="clear" w:color="auto" w:fill="F2F2F2"/>
-          </w:tcPr>
           <w:tcPr/>
           <w:p>
             <w:pPr>
@@ -1642,9 +1769,6 @@
           </w:p>
         </w:tc>
         <w:tc>
-          <w:tcPr>
-            <w:shd w:val="clear" w:color="auto" w:fill="F2F2F2"/>
-          </w:tcPr>
           <w:tcPr/>
           <w:p>
             <w:pPr>
@@ -1766,6 +1890,9 @@
       </w:tr>
       <w:tr>
         <w:tc>
+          <w:tcPr>
+            <w:shd w:val="clear" w:color="auto" w:fill="F2F2F2"/>
+          </w:tcPr>
           <w:tcPr/>
           <w:p>
             <w:pPr>
@@ -1777,6 +1904,9 @@
           </w:p>
         </w:tc>
         <w:tc>
+          <w:tcPr>
+            <w:shd w:val="clear" w:color="auto" w:fill="F2F2F2"/>
+          </w:tcPr>
           <w:tcPr/>
           <w:p>
             <w:pPr>
@@ -1788,6 +1918,9 @@
           </w:p>
         </w:tc>
         <w:tc>
+          <w:tcPr>
+            <w:shd w:val="clear" w:color="auto" w:fill="F2F2F2"/>
+          </w:tcPr>
           <w:tcPr/>
           <w:p>
             <w:pPr>
@@ -1799,6 +1932,9 @@
           </w:p>
         </w:tc>
         <w:tc>
+          <w:tcPr>
+            <w:shd w:val="clear" w:color="auto" w:fill="F2F2F2"/>
+          </w:tcPr>
           <w:tcPr/>
           <w:p>
             <w:pPr>
@@ -2055,9 +2191,6 @@
       </w:tr>
       <w:tr>
         <w:tc>
-          <w:tcPr>
-            <w:shd w:val="clear" w:color="auto" w:fill="F2F2F2"/>
-          </w:tcPr>
           <w:tcPr/>
           <w:p>
             <w:pPr>
@@ -2069,9 +2202,6 @@
           </w:p>
         </w:tc>
         <w:tc>
-          <w:tcPr>
-            <w:shd w:val="clear" w:color="auto" w:fill="F2F2F2"/>
-          </w:tcPr>
           <w:tcPr/>
           <w:p>
             <w:pPr>
@@ -2083,9 +2213,6 @@
           </w:p>
         </w:tc>
         <w:tc>
-          <w:tcPr>
-            <w:shd w:val="clear" w:color="auto" w:fill="F2F2F2"/>
-          </w:tcPr>
           <w:tcPr/>
           <w:p>
             <w:pPr>
@@ -2097,9 +2224,6 @@
           </w:p>
         </w:tc>
         <w:tc>
-          <w:tcPr>
-            <w:shd w:val="clear" w:color="auto" w:fill="F2F2F2"/>
-          </w:tcPr>
           <w:tcPr/>
           <w:p>
             <w:pPr>
@@ -2219,6 +2343,9 @@
       </w:tr>
       <w:tr>
         <w:tc>
+          <w:tcPr>
+            <w:shd w:val="clear" w:color="auto" w:fill="F2F2F2"/>
+          </w:tcPr>
           <w:tcPr/>
           <w:p>
             <w:pPr>
@@ -2230,6 +2357,9 @@
           </w:p>
         </w:tc>
         <w:tc>
+          <w:tcPr>
+            <w:shd w:val="clear" w:color="auto" w:fill="F2F2F2"/>
+          </w:tcPr>
           <w:tcPr/>
           <w:p>
             <w:pPr>
@@ -2241,6 +2371,9 @@
           </w:p>
         </w:tc>
         <w:tc>
+          <w:tcPr>
+            <w:shd w:val="clear" w:color="auto" w:fill="F2F2F2"/>
+          </w:tcPr>
           <w:tcPr/>
           <w:p>
             <w:pPr>
@@ -2252,6 +2385,9 @@
           </w:p>
         </w:tc>
         <w:tc>
+          <w:tcPr>
+            <w:shd w:val="clear" w:color="auto" w:fill="F2F2F2"/>
+          </w:tcPr>
           <w:tcPr/>
           <w:p>
             <w:pPr>
@@ -2341,9 +2477,6 @@
       </w:tr>
       <w:tr>
         <w:tc>
-          <w:tcPr>
-            <w:shd w:val="clear" w:color="auto" w:fill="F2F2F2"/>
-          </w:tcPr>
           <w:tcPr/>
           <w:p>
             <w:pPr>
@@ -2355,9 +2488,6 @@
           </w:p>
         </w:tc>
         <w:tc>
-          <w:tcPr>
-            <w:shd w:val="clear" w:color="auto" w:fill="F2F2F2"/>
-          </w:tcPr>
           <w:tcPr/>
           <w:p>
             <w:pPr>
@@ -2369,9 +2499,6 @@
           </w:p>
         </w:tc>
         <w:tc>
-          <w:tcPr>
-            <w:shd w:val="clear" w:color="auto" w:fill="F2F2F2"/>
-          </w:tcPr>
           <w:tcPr/>
           <w:p>
             <w:pPr>
@@ -2383,9 +2510,6 @@
           </w:p>
         </w:tc>
         <w:tc>
-          <w:tcPr>
-            <w:shd w:val="clear" w:color="auto" w:fill="F2F2F2"/>
-          </w:tcPr>
           <w:tcPr/>
           <w:p>
             <w:pPr>
@@ -2409,6 +2533,9 @@
       </w:tr>
       <w:tr>
         <w:tc>
+          <w:tcPr>
+            <w:shd w:val="clear" w:color="auto" w:fill="F2F2F2"/>
+          </w:tcPr>
           <w:tcPr/>
           <w:p>
             <w:pPr>
@@ -2420,6 +2547,9 @@
           </w:p>
         </w:tc>
         <w:tc>
+          <w:tcPr>
+            <w:shd w:val="clear" w:color="auto" w:fill="F2F2F2"/>
+          </w:tcPr>
           <w:tcPr/>
           <w:p>
             <w:pPr>
@@ -2431,6 +2561,9 @@
           </w:p>
         </w:tc>
         <w:tc>
+          <w:tcPr>
+            <w:shd w:val="clear" w:color="auto" w:fill="F2F2F2"/>
+          </w:tcPr>
           <w:tcPr/>
           <w:p>
             <w:pPr>
@@ -2442,6 +2575,9 @@
           </w:p>
         </w:tc>
         <w:tc>
+          <w:tcPr>
+            <w:shd w:val="clear" w:color="auto" w:fill="F2F2F2"/>
+          </w:tcPr>
           <w:tcPr/>
           <w:p>
             <w:pPr>
@@ -26464,7 +26600,23 @@
         <w:t xml:space="preserve"> </w:t>
       </w:r>
       <w:r>
-        <w:t xml:space="preserve">records for graph traversal. Both directions (parent→children, child→parent) SHALL be queryable. This applies equally to auto-split sublots (FDS-05-009), per-cavity sublots (FDS-05-023), and basket-level sublots created ad-hoc at container close.</w:t>
+        <w:t xml:space="preserve">records for graph traversal. Both directions (parent→children, child→parent) SHALL be queryable. This applies equally to auto-split sublots (FDS-05-009) and to basket-level sublots created ad-hoc at container close. It does</w:t>
+      </w:r>
+      <w:r>
+        <w:t xml:space="preserve"> </w:t>
+      </w:r>
+      <w:r>
+        <w:rPr>
+          <w:b/>
+          <w:bCs/>
+        </w:rPr>
+        <w:t xml:space="preserve">not</w:t>
+      </w:r>
+      <w:r>
+        <w:t xml:space="preserve"> </w:t>
+      </w:r>
+      <w:r>
+        <w:t xml:space="preserve">apply to Die Cast per-cavity baskets: since the 2026-07-29 per-cavity redesign each cavity accumulates its own independent LOT (FDS-05-039), not a sublot of a shared parent, so no parent→child edge is created there.</w:t>
       </w:r>
     </w:p>
     <w:bookmarkEnd w:id="135"/>

</xml_diff>

<commit_message>
docs: operator PIN sign-in replaces initials in FDS section 4
FDS-04-002 retitled to Operator PIN Capture; FDS-04-004's "no
clock-number/PIN convenience login" prohibition struck -- that clause barred
a credential login, whereas a PIN establishes presence only and confers no
privilege, with per-action AD elevation unchanged. FDS-04-001 gains Pin,
NOT NULL for both identity classes. FDS-04-010 rewritten: operators
self-provision at the terminal, there is no pre-loaded roster, and re-entry
is the prominent action so a typo cannot become a duplicate person.

Data model documents the column, its unfiltered UNIQUE, the format CHECK,
and why leading zeros force a string type. Notes explicitly that Pin is not
a revival of the dropped PinHash -- that was a hashed credential, this is a
plaintext identifier.

Co-Authored-By: Claude Opus 5 <noreply@anthropic.com>
</commit_message>
<xml_diff>
--- a/MPP_MES_FDS.docx
+++ b/MPP_MES_FDS.docx
@@ -428,11 +428,366 @@
               <w:pStyle w:val="Compact"/>
             </w:pPr>
             <w:r>
+              <w:t xml:space="preserve">1.8</w:t>
+            </w:r>
+          </w:p>
+        </w:tc>
+        <w:tc>
+          <w:tcPr/>
+          <w:p>
+            <w:pPr>
+              <w:pStyle w:val="Compact"/>
+            </w:pPr>
+            <w:r>
+              <w:t xml:space="preserve">2026-09-02</w:t>
+            </w:r>
+          </w:p>
+        </w:tc>
+        <w:tc>
+          <w:tcPr/>
+          <w:p>
+            <w:pPr>
+              <w:pStyle w:val="Compact"/>
+            </w:pPr>
+            <w:r>
+              <w:t xml:space="preserve">Blue Ridge Automation</w:t>
+            </w:r>
+          </w:p>
+        </w:tc>
+        <w:tc>
+          <w:tcPr/>
+          <w:p>
+            <w:pPr>
+              <w:pStyle w:val="Compact"/>
+            </w:pPr>
+            <w:r>
+              <w:rPr>
+                <w:b/>
+                <w:bCs/>
+              </w:rPr>
+              <w:t xml:space="preserve">Operator sign-in moves from initials to a 5-digit PIN.</w:t>
+            </w:r>
+            <w:r>
+              <w:t xml:space="preserve"> </w:t>
+            </w:r>
+            <w:r>
+              <w:rPr>
+                <w:b/>
+                <w:bCs/>
+              </w:rPr>
+              <w:t xml:space="preserve">FDS-04-002</w:t>
+            </w:r>
+            <w:r>
+              <w:t xml:space="preserve"> </w:t>
+            </w:r>
+            <w:r>
+              <w:t xml:space="preserve">retitled</w:t>
+            </w:r>
+            <w:r>
+              <w:t xml:space="preserve"> </w:t>
+            </w:r>
+            <w:r>
+              <w:rPr>
+                <w:i/>
+                <w:iCs/>
+              </w:rPr>
+              <w:t xml:space="preserve">Operator PIN Capture</w:t>
+            </w:r>
+            <w:r>
+              <w:t xml:space="preserve"> </w:t>
+            </w:r>
+            <w:r>
+              <w:t xml:space="preserve">— the terminal prompts for a PIN and resolves it via the new</w:t>
+            </w:r>
+            <w:r>
+              <w:t xml:space="preserve"> </w:t>
+            </w:r>
+            <w:r>
+              <w:rPr>
+                <w:rStyle w:val="VerbatimChar"/>
+              </w:rPr>
+              <w:t xml:space="preserve">Location.AppUser_GetActiveByPin</w:t>
+            </w:r>
+            <w:r>
+              <w:t xml:space="preserve">; the PIN is an</w:t>
+            </w:r>
+            <w:r>
+              <w:t xml:space="preserve"> </w:t>
+            </w:r>
+            <w:r>
+              <w:rPr>
+                <w:b/>
+                <w:bCs/>
+              </w:rPr>
+              <w:t xml:space="preserve">identifier, not a credential</w:t>
+            </w:r>
+            <w:r>
+              <w:t xml:space="preserve"> </w:t>
+            </w:r>
+            <w:r>
+              <w:t xml:space="preserve">(plaintext, admin-visible, echoed on screen, verifies no secret) and replaces initials as the sign-in key only because MPP already issues PINs internally.</w:t>
+            </w:r>
+            <w:r>
+              <w:t xml:space="preserve"> </w:t>
+            </w:r>
+            <w:r>
+              <w:rPr>
+                <w:b/>
+                <w:bCs/>
+              </w:rPr>
+              <w:t xml:space="preserve">FDS-04-004</w:t>
+            </w:r>
+            <w:r>
+              <w:t xml:space="preserve">’s</w:t>
+            </w:r>
+            <w:r>
+              <w:t xml:space="preserve"> </w:t>
+            </w:r>
+            <w:r>
+              <w:t xml:space="preserve">“no clock-number/PIN convenience login”</w:t>
+            </w:r>
+            <w:r>
+              <w:t xml:space="preserve"> </w:t>
+            </w:r>
+            <w:r>
+              <w:t xml:space="preserve">prohibition is struck: that clause barred a</w:t>
+            </w:r>
+            <w:r>
+              <w:t xml:space="preserve"> </w:t>
+            </w:r>
+            <w:r>
+              <w:rPr>
+                <w:i/>
+                <w:iCs/>
+              </w:rPr>
+              <w:t xml:space="preserve">credential</w:t>
+            </w:r>
+            <w:r>
+              <w:t xml:space="preserve"> </w:t>
+            </w:r>
+            <w:r>
+              <w:t xml:space="preserve">login, whereas a PIN establishes presence only and confers no privilege — nothing reads the signed-in user’s</w:t>
+            </w:r>
+            <w:r>
+              <w:t xml:space="preserve"> </w:t>
+            </w:r>
+            <w:r>
+              <w:rPr>
+                <w:rStyle w:val="VerbatimChar"/>
+              </w:rPr>
+              <w:t xml:space="preserve">IgnitionRole</w:t>
+            </w:r>
+            <w:r>
+              <w:t xml:space="preserve"> </w:t>
+            </w:r>
+            <w:r>
+              <w:t xml:space="preserve">as an authorisation gate, and every elevated action still takes a per-action AD credential (</w:t>
+            </w:r>
+            <w:r>
+              <w:rPr>
+                <w:b/>
+                <w:bCs/>
+              </w:rPr>
+              <w:t xml:space="preserve">FDS-04-007</w:t>
+            </w:r>
+            <w:r>
+              <w:t xml:space="preserve">, unchanged). A supervisor covering a break therefore does a plain PIN swap with no elevation.</w:t>
+            </w:r>
+            <w:r>
+              <w:t xml:space="preserve"> </w:t>
+            </w:r>
+            <w:r>
+              <w:rPr>
+                <w:b/>
+                <w:bCs/>
+              </w:rPr>
+              <w:t xml:space="preserve">FDS-04-001</w:t>
+            </w:r>
+            <w:r>
+              <w:t xml:space="preserve"> </w:t>
+            </w:r>
+            <w:r>
+              <w:t xml:space="preserve">identity table gains</w:t>
+            </w:r>
+            <w:r>
+              <w:t xml:space="preserve"> </w:t>
+            </w:r>
+            <w:r>
+              <w:rPr>
+                <w:rStyle w:val="VerbatimChar"/>
+              </w:rPr>
+              <w:t xml:space="preserve">Pin</w:t>
+            </w:r>
+            <w:r>
+              <w:t xml:space="preserve">,</w:t>
+            </w:r>
+            <w:r>
+              <w:t xml:space="preserve"> </w:t>
+            </w:r>
+            <w:r>
+              <w:rPr>
+                <w:rStyle w:val="VerbatimChar"/>
+              </w:rPr>
+              <w:t xml:space="preserve">NOT NULL</w:t>
+            </w:r>
+            <w:r>
+              <w:t xml:space="preserve"> </w:t>
+            </w:r>
+            <w:r>
+              <w:t xml:space="preserve">for</w:t>
+            </w:r>
+            <w:r>
+              <w:t xml:space="preserve"> </w:t>
+            </w:r>
+            <w:r>
+              <w:rPr>
+                <w:i/>
+                <w:iCs/>
+              </w:rPr>
+              <w:t xml:space="preserve">both</w:t>
+            </w:r>
+            <w:r>
+              <w:t xml:space="preserve"> </w:t>
+            </w:r>
+            <w:r>
+              <w:t xml:space="preserve">identity classes, with leading zeros significant (full-time</w:t>
+            </w:r>
+            <w:r>
+              <w:t xml:space="preserve"> </w:t>
+            </w:r>
+            <w:r>
+              <w:rPr>
+                <w:rStyle w:val="VerbatimChar"/>
+              </w:rPr>
+              <w:t xml:space="preserve">04218</w:t>
+            </w:r>
+            <w:r>
+              <w:t xml:space="preserve"> </w:t>
+            </w:r>
+            <w:r>
+              <w:t xml:space="preserve">vs temp</w:t>
+            </w:r>
+            <w:r>
+              <w:t xml:space="preserve"> </w:t>
+            </w:r>
+            <w:r>
+              <w:rPr>
+                <w:rStyle w:val="VerbatimChar"/>
+              </w:rPr>
+              <w:t xml:space="preserve">40218</w:t>
+            </w:r>
+            <w:r>
+              <w:t xml:space="preserve">) and therefore string-typed end to end.</w:t>
+            </w:r>
+            <w:r>
+              <w:t xml:space="preserve"> </w:t>
+            </w:r>
+            <w:r>
+              <w:rPr>
+                <w:b/>
+                <w:bCs/>
+              </w:rPr>
+              <w:t xml:space="preserve">FDS-04-005</w:t>
+            </w:r>
+            <w:r>
+              <w:t xml:space="preserve"> </w:t>
+            </w:r>
+            <w:r>
+              <w:t xml:space="preserve">presence resolution repointed at the active-only resolvers.</w:t>
+            </w:r>
+            <w:r>
+              <w:t xml:space="preserve"> </w:t>
+            </w:r>
+            <w:r>
+              <w:rPr>
+                <w:b/>
+                <w:bCs/>
+              </w:rPr>
+              <w:t xml:space="preserve">FDS-04-010</w:t>
+            </w:r>
+            <w:r>
+              <w:t xml:space="preserve"> </w:t>
+            </w:r>
+            <w:r>
+              <w:t xml:space="preserve">rewritten: operators</w:t>
+            </w:r>
+            <w:r>
+              <w:t xml:space="preserve"> </w:t>
+            </w:r>
+            <w:r>
+              <w:rPr>
+                <w:b/>
+                <w:bCs/>
+              </w:rPr>
+              <w:t xml:space="preserve">self-provision at the terminal</w:t>
+            </w:r>
+            <w:r>
+              <w:t xml:space="preserve"> </w:t>
+            </w:r>
+            <w:r>
+              <w:t xml:space="preserve">on first unrecognised PIN — there is no pre-loaded roster and no seed dependency — with re-entry as the prominent action so a mistyped digit cannot become a duplicate person. Initials and DisplayName are retained unchanged as attribution fields. Migration</w:t>
+            </w:r>
+            <w:r>
+              <w:t xml:space="preserve"> </w:t>
+            </w:r>
+            <w:r>
+              <w:rPr>
+                <w:rStyle w:val="VerbatimChar"/>
+              </w:rPr>
+              <w:t xml:space="preserve">0069_appuser_pin.sql</w:t>
+            </w:r>
+            <w:r>
+              <w:t xml:space="preserve">; procs</w:t>
+            </w:r>
+            <w:r>
+              <w:t xml:space="preserve"> </w:t>
+            </w:r>
+            <w:r>
+              <w:rPr>
+                <w:rStyle w:val="VerbatimChar"/>
+              </w:rPr>
+              <w:t xml:space="preserve">AppUser_GetActiveByPin</w:t>
+            </w:r>
+            <w:r>
+              <w:t xml:space="preserve"> </w:t>
+            </w:r>
+            <w:r>
+              <w:t xml:space="preserve">/</w:t>
+            </w:r>
+            <w:r>
+              <w:t xml:space="preserve"> </w:t>
+            </w:r>
+            <w:r>
+              <w:rPr>
+                <w:rStyle w:val="VerbatimChar"/>
+              </w:rPr>
+              <w:t xml:space="preserve">AppUser_GetByPin</w:t>
+            </w:r>
+            <w:r>
+              <w:t xml:space="preserve">.</w:t>
+            </w:r>
+          </w:p>
+        </w:tc>
+      </w:tr>
+      <w:tr>
+        <w:tc>
+          <w:tcPr>
+            <w:shd w:val="clear" w:color="auto" w:fill="F2F2F2"/>
+          </w:tcPr>
+          <w:tcPr/>
+          <w:p>
+            <w:pPr>
+              <w:pStyle w:val="Compact"/>
+            </w:pPr>
+            <w:r>
               <w:t xml:space="preserve">1.7</w:t>
             </w:r>
           </w:p>
         </w:tc>
         <w:tc>
+          <w:tcPr>
+            <w:shd w:val="clear" w:color="auto" w:fill="F2F2F2"/>
+          </w:tcPr>
           <w:tcPr/>
           <w:p>
             <w:pPr>
@@ -444,6 +799,9 @@
           </w:p>
         </w:tc>
         <w:tc>
+          <w:tcPr>
+            <w:shd w:val="clear" w:color="auto" w:fill="F2F2F2"/>
+          </w:tcPr>
           <w:tcPr/>
           <w:p>
             <w:pPr>
@@ -455,6 +813,9 @@
           </w:p>
         </w:tc>
         <w:tc>
+          <w:tcPr>
+            <w:shd w:val="clear" w:color="auto" w:fill="F2F2F2"/>
+          </w:tcPr>
           <w:tcPr/>
           <w:p>
             <w:pPr>
@@ -971,9 +1332,6 @@
       </w:tr>
       <w:tr>
         <w:tc>
-          <w:tcPr>
-            <w:shd w:val="clear" w:color="auto" w:fill="F2F2F2"/>
-          </w:tcPr>
           <w:tcPr/>
           <w:p>
             <w:pPr>
@@ -985,9 +1343,6 @@
           </w:p>
         </w:tc>
         <w:tc>
-          <w:tcPr>
-            <w:shd w:val="clear" w:color="auto" w:fill="F2F2F2"/>
-          </w:tcPr>
           <w:tcPr/>
           <w:p>
             <w:pPr>
@@ -999,9 +1354,6 @@
           </w:p>
         </w:tc>
         <w:tc>
-          <w:tcPr>
-            <w:shd w:val="clear" w:color="auto" w:fill="F2F2F2"/>
-          </w:tcPr>
           <w:tcPr/>
           <w:p>
             <w:pPr>
@@ -1013,9 +1365,6 @@
           </w:p>
         </w:tc>
         <w:tc>
-          <w:tcPr>
-            <w:shd w:val="clear" w:color="auto" w:fill="F2F2F2"/>
-          </w:tcPr>
           <w:tcPr/>
           <w:p>
             <w:pPr>
@@ -1322,6 +1671,9 @@
       </w:tr>
       <w:tr>
         <w:tc>
+          <w:tcPr>
+            <w:shd w:val="clear" w:color="auto" w:fill="F2F2F2"/>
+          </w:tcPr>
           <w:tcPr/>
           <w:p>
             <w:pPr>
@@ -1333,6 +1685,9 @@
           </w:p>
         </w:tc>
         <w:tc>
+          <w:tcPr>
+            <w:shd w:val="clear" w:color="auto" w:fill="F2F2F2"/>
+          </w:tcPr>
           <w:tcPr/>
           <w:p>
             <w:pPr>
@@ -1344,6 +1699,9 @@
           </w:p>
         </w:tc>
         <w:tc>
+          <w:tcPr>
+            <w:shd w:val="clear" w:color="auto" w:fill="F2F2F2"/>
+          </w:tcPr>
           <w:tcPr/>
           <w:p>
             <w:pPr>
@@ -1355,6 +1713,9 @@
           </w:p>
         </w:tc>
         <w:tc>
+          <w:tcPr>
+            <w:shd w:val="clear" w:color="auto" w:fill="F2F2F2"/>
+          </w:tcPr>
           <w:tcPr/>
           <w:p>
             <w:pPr>
@@ -1600,9 +1961,6 @@
       </w:tr>
       <w:tr>
         <w:tc>
-          <w:tcPr>
-            <w:shd w:val="clear" w:color="auto" w:fill="F2F2F2"/>
-          </w:tcPr>
           <w:tcPr/>
           <w:p>
             <w:pPr>
@@ -1614,9 +1972,6 @@
           </w:p>
         </w:tc>
         <w:tc>
-          <w:tcPr>
-            <w:shd w:val="clear" w:color="auto" w:fill="F2F2F2"/>
-          </w:tcPr>
           <w:tcPr/>
           <w:p>
             <w:pPr>
@@ -1628,9 +1983,6 @@
           </w:p>
         </w:tc>
         <w:tc>
-          <w:tcPr>
-            <w:shd w:val="clear" w:color="auto" w:fill="F2F2F2"/>
-          </w:tcPr>
           <w:tcPr/>
           <w:p>
             <w:pPr>
@@ -1642,9 +1994,6 @@
           </w:p>
         </w:tc>
         <w:tc>
-          <w:tcPr>
-            <w:shd w:val="clear" w:color="auto" w:fill="F2F2F2"/>
-          </w:tcPr>
           <w:tcPr/>
           <w:p>
             <w:pPr>
@@ -1766,6 +2115,9 @@
       </w:tr>
       <w:tr>
         <w:tc>
+          <w:tcPr>
+            <w:shd w:val="clear" w:color="auto" w:fill="F2F2F2"/>
+          </w:tcPr>
           <w:tcPr/>
           <w:p>
             <w:pPr>
@@ -1777,6 +2129,9 @@
           </w:p>
         </w:tc>
         <w:tc>
+          <w:tcPr>
+            <w:shd w:val="clear" w:color="auto" w:fill="F2F2F2"/>
+          </w:tcPr>
           <w:tcPr/>
           <w:p>
             <w:pPr>
@@ -1788,6 +2143,9 @@
           </w:p>
         </w:tc>
         <w:tc>
+          <w:tcPr>
+            <w:shd w:val="clear" w:color="auto" w:fill="F2F2F2"/>
+          </w:tcPr>
           <w:tcPr/>
           <w:p>
             <w:pPr>
@@ -1799,6 +2157,9 @@
           </w:p>
         </w:tc>
         <w:tc>
+          <w:tcPr>
+            <w:shd w:val="clear" w:color="auto" w:fill="F2F2F2"/>
+          </w:tcPr>
           <w:tcPr/>
           <w:p>
             <w:pPr>
@@ -2055,9 +2416,6 @@
       </w:tr>
       <w:tr>
         <w:tc>
-          <w:tcPr>
-            <w:shd w:val="clear" w:color="auto" w:fill="F2F2F2"/>
-          </w:tcPr>
           <w:tcPr/>
           <w:p>
             <w:pPr>
@@ -2069,9 +2427,6 @@
           </w:p>
         </w:tc>
         <w:tc>
-          <w:tcPr>
-            <w:shd w:val="clear" w:color="auto" w:fill="F2F2F2"/>
-          </w:tcPr>
           <w:tcPr/>
           <w:p>
             <w:pPr>
@@ -2083,9 +2438,6 @@
           </w:p>
         </w:tc>
         <w:tc>
-          <w:tcPr>
-            <w:shd w:val="clear" w:color="auto" w:fill="F2F2F2"/>
-          </w:tcPr>
           <w:tcPr/>
           <w:p>
             <w:pPr>
@@ -2097,9 +2449,6 @@
           </w:p>
         </w:tc>
         <w:tc>
-          <w:tcPr>
-            <w:shd w:val="clear" w:color="auto" w:fill="F2F2F2"/>
-          </w:tcPr>
           <w:tcPr/>
           <w:p>
             <w:pPr>
@@ -2219,6 +2568,9 @@
       </w:tr>
       <w:tr>
         <w:tc>
+          <w:tcPr>
+            <w:shd w:val="clear" w:color="auto" w:fill="F2F2F2"/>
+          </w:tcPr>
           <w:tcPr/>
           <w:p>
             <w:pPr>
@@ -2230,6 +2582,9 @@
           </w:p>
         </w:tc>
         <w:tc>
+          <w:tcPr>
+            <w:shd w:val="clear" w:color="auto" w:fill="F2F2F2"/>
+          </w:tcPr>
           <w:tcPr/>
           <w:p>
             <w:pPr>
@@ -2241,6 +2596,9 @@
           </w:p>
         </w:tc>
         <w:tc>
+          <w:tcPr>
+            <w:shd w:val="clear" w:color="auto" w:fill="F2F2F2"/>
+          </w:tcPr>
           <w:tcPr/>
           <w:p>
             <w:pPr>
@@ -2252,6 +2610,9 @@
           </w:p>
         </w:tc>
         <w:tc>
+          <w:tcPr>
+            <w:shd w:val="clear" w:color="auto" w:fill="F2F2F2"/>
+          </w:tcPr>
           <w:tcPr/>
           <w:p>
             <w:pPr>
@@ -2341,9 +2702,6 @@
       </w:tr>
       <w:tr>
         <w:tc>
-          <w:tcPr>
-            <w:shd w:val="clear" w:color="auto" w:fill="F2F2F2"/>
-          </w:tcPr>
           <w:tcPr/>
           <w:p>
             <w:pPr>
@@ -2355,9 +2713,6 @@
           </w:p>
         </w:tc>
         <w:tc>
-          <w:tcPr>
-            <w:shd w:val="clear" w:color="auto" w:fill="F2F2F2"/>
-          </w:tcPr>
           <w:tcPr/>
           <w:p>
             <w:pPr>
@@ -2369,9 +2724,6 @@
           </w:p>
         </w:tc>
         <w:tc>
-          <w:tcPr>
-            <w:shd w:val="clear" w:color="auto" w:fill="F2F2F2"/>
-          </w:tcPr>
           <w:tcPr/>
           <w:p>
             <w:pPr>
@@ -2383,9 +2735,6 @@
           </w:p>
         </w:tc>
         <w:tc>
-          <w:tcPr>
-            <w:shd w:val="clear" w:color="auto" w:fill="F2F2F2"/>
-          </w:tcPr>
           <w:tcPr/>
           <w:p>
             <w:pPr>
@@ -2409,6 +2758,9 @@
       </w:tr>
       <w:tr>
         <w:tc>
+          <w:tcPr>
+            <w:shd w:val="clear" w:color="auto" w:fill="F2F2F2"/>
+          </w:tcPr>
           <w:tcPr/>
           <w:p>
             <w:pPr>
@@ -2420,6 +2772,9 @@
           </w:p>
         </w:tc>
         <w:tc>
+          <w:tcPr>
+            <w:shd w:val="clear" w:color="auto" w:fill="F2F2F2"/>
+          </w:tcPr>
           <w:tcPr/>
           <w:p>
             <w:pPr>
@@ -2431,6 +2786,9 @@
           </w:p>
         </w:tc>
         <w:tc>
+          <w:tcPr>
+            <w:shd w:val="clear" w:color="auto" w:fill="F2F2F2"/>
+          </w:tcPr>
           <w:tcPr/>
           <w:p>
             <w:pPr>
@@ -2442,6 +2800,9 @@
           </w:p>
         </w:tc>
         <w:tc>
+          <w:tcPr>
+            <w:shd w:val="clear" w:color="auto" w:fill="F2F2F2"/>
+          </w:tcPr>
           <w:tcPr/>
           <w:p>
             <w:pPr>
@@ -18419,7 +18780,23 @@
         <w:pStyle w:val="FirstParagraph"/>
       </w:pPr>
       <w:r>
-        <w:t xml:space="preserve">Operators do not authenticate. They are identified on a terminal by their initials, which are stamped onto every event. Elevated actions (holds, overrides, scrap, maintenance WOs, admin edits) require an Active Directory login at the moment of action — no session-sticky elevation, no clock-number/PIN convenience login.</w:t>
+        <w:t xml:space="preserve">Operators do not authenticate. They are identified on a terminal by a</w:t>
+      </w:r>
+      <w:r>
+        <w:t xml:space="preserve"> </w:t>
+      </w:r>
+      <w:r>
+        <w:rPr>
+          <w:b/>
+          <w:bCs/>
+        </w:rPr>
+        <w:t xml:space="preserve">5-digit PIN</w:t>
+      </w:r>
+      <w:r>
+        <w:t xml:space="preserve"> </w:t>
+      </w:r>
+      <w:r>
+        <w:t xml:space="preserve">— an identifier MPP already issues internally, not a credential — and the resolved user is stamped onto every event. Elevated actions (holds, overrides, scrap, maintenance WOs, admin edits) require an Active Directory login at the moment of action — no session-sticky elevation. Entering a PIN establishes presence only and confers no privilege whatsoever.</w:t>
       </w:r>
     </w:p>
     <w:bookmarkStart w:id="99" w:name="identity-model"/>
@@ -18476,11 +18853,12 @@
         <w:tblLook w:firstRow="1" w:lastRow="0" w:firstColumn="0" w:lastColumn="0" w:noHBand="0" w:noVBand="1" w:val="0220"/>
       </w:tblPr>
       <w:tblGrid>
-        <w:gridCol w:w="1584"/>
-        <w:gridCol w:w="1584"/>
-        <w:gridCol w:w="1584"/>
-        <w:gridCol w:w="1584"/>
-        <w:gridCol w:w="1584"/>
+        <w:gridCol w:w="1320"/>
+        <w:gridCol w:w="1320"/>
+        <w:gridCol w:w="1320"/>
+        <w:gridCol w:w="1320"/>
+        <w:gridCol w:w="1320"/>
+        <w:gridCol w:w="1320"/>
       </w:tblGrid>
       <w:tr>
         <w:trPr>
@@ -18554,6 +18932,24 @@
                 <w:b/>
                 <w:color w:val="FFFFFF"/>
               </w:rPr>
+              <w:t xml:space="preserve">Pin</w:t>
+            </w:r>
+          </w:p>
+        </w:tc>
+        <w:tc>
+          <w:tcPr>
+            <w:shd w:val="clear" w:color="auto" w:fill="1F4E79"/>
+          </w:tcPr>
+          <w:tcPr/>
+          <w:p>
+            <w:pPr>
+              <w:pStyle w:val="Compact"/>
+            </w:pPr>
+            <w:r>
+              <w:rPr>
+                <w:b/>
+                <w:color w:val="FFFFFF"/>
+              </w:rPr>
               <w:t xml:space="preserve">IgnitionRole</w:t>
             </w:r>
           </w:p>
@@ -18618,6 +19014,17 @@
               <w:pStyle w:val="Compact"/>
             </w:pPr>
             <w:r>
+              <w:t xml:space="preserve">NOT NULL</w:t>
+            </w:r>
+          </w:p>
+        </w:tc>
+        <w:tc>
+          <w:tcPr/>
+          <w:p>
+            <w:pPr>
+              <w:pStyle w:val="Compact"/>
+            </w:pPr>
+            <w:r>
               <w:t xml:space="preserve">NULL</w:t>
             </w:r>
           </w:p>
@@ -18629,7 +19036,7 @@
               <w:pStyle w:val="Compact"/>
             </w:pPr>
             <w:r>
-              <w:t xml:space="preserve">Initials entered at a shop-floor terminal</w:t>
+              <w:t xml:space="preserve">PIN entered at a shop-floor terminal</w:t>
             </w:r>
           </w:p>
         </w:tc>
@@ -18701,7 +19108,21 @@
               <w:pStyle w:val="Compact"/>
             </w:pPr>
             <w:r>
-              <w:t xml:space="preserve">Active Directory login</w:t>
+              <w:t xml:space="preserve">NOT NULL</w:t>
+            </w:r>
+          </w:p>
+        </w:tc>
+        <w:tc>
+          <w:tcPr>
+            <w:shd w:val="clear" w:color="auto" w:fill="F2F2F2"/>
+          </w:tcPr>
+          <w:tcPr/>
+          <w:p>
+            <w:pPr>
+              <w:pStyle w:val="Compact"/>
+            </w:pPr>
+            <w:r>
+              <w:t xml:space="preserve">Active Directory login for elevation; PIN for terminal presence</w:t>
             </w:r>
           </w:p>
         </w:tc>
@@ -18712,67 +19133,31 @@
         <w:pStyle w:val="BodyText"/>
       </w:pPr>
       <w:r>
-        <w:t xml:space="preserve">Every event and mutation SHALL stamp</w:t>
-      </w:r>
-      <w:r>
-        <w:t xml:space="preserve"> </w:t>
-      </w:r>
-      <w:r>
-        <w:rPr>
-          <w:rStyle w:val="VerbatimChar"/>
-        </w:rPr>
-        <w:t xml:space="preserve">AppUserId</w:t>
-      </w:r>
-      <w:r>
-        <w:t xml:space="preserve"> </w:t>
-      </w:r>
-      <w:r>
-        <w:t xml:space="preserve">— never free-text initials or names. Initials are a natural key used at the UI layer only; the database records the resolved</w:t>
-      </w:r>
-      <w:r>
-        <w:t xml:space="preserve"> </w:t>
-      </w:r>
-      <w:r>
-        <w:rPr>
-          <w:rStyle w:val="VerbatimChar"/>
-        </w:rPr>
-        <w:t xml:space="preserve">AppUserId</w:t>
-      </w:r>
-      <w:r>
-        <w:t xml:space="preserve">.</w:t>
-      </w:r>
-    </w:p>
-    <w:bookmarkEnd w:id="95"/>
-    <w:bookmarkStart w:id="96" w:name="fds-04-002-operator-initials-capture"/>
-    <w:p>
-      <w:pPr>
-        <w:pStyle w:val="Heading4"/>
-      </w:pPr>
-      <w:r>
-        <w:t xml:space="preserve">FDS-04-002 — Operator Initials Capture</w:t>
-      </w:r>
-    </w:p>
-    <w:p>
-      <w:pPr>
-        <w:pStyle w:val="FirstParagraph"/>
-      </w:pPr>
-      <w:r>
-        <w:t xml:space="preserve">When an operator approaches a shop-floor terminal to perform their first action, the UI SHALL prompt for initials. The MES SHALL look up the</w:t>
-      </w:r>
-      <w:r>
-        <w:t xml:space="preserve"> </w:t>
-      </w:r>
-      <w:r>
-        <w:rPr>
-          <w:rStyle w:val="VerbatimChar"/>
-        </w:rPr>
-        <w:t xml:space="preserve">AppUser</w:t>
-      </w:r>
-      <w:r>
-        <w:t xml:space="preserve"> </w:t>
-      </w:r>
-      <w:r>
-        <w:t xml:space="preserve">by initials and establish an</w:t>
+        <w:rPr>
+          <w:rStyle w:val="VerbatimChar"/>
+        </w:rPr>
+        <w:t xml:space="preserve">Pin</w:t>
+      </w:r>
+      <w:r>
+        <w:t xml:space="preserve"> </w:t>
+      </w:r>
+      <w:r>
+        <w:t xml:space="preserve">is</w:t>
+      </w:r>
+      <w:r>
+        <w:t xml:space="preserve"> </w:t>
+      </w:r>
+      <w:r>
+        <w:rPr>
+          <w:rStyle w:val="VerbatimChar"/>
+        </w:rPr>
+        <w:t xml:space="preserve">NOT NULL</w:t>
+      </w:r>
+      <w:r>
+        <w:t xml:space="preserve"> </w:t>
+      </w:r>
+      <w:r>
+        <w:t xml:space="preserve">for</w:t>
       </w:r>
       <w:r>
         <w:t xml:space="preserve"> </w:t>
@@ -18782,13 +19167,228 @@
           <w:b/>
           <w:bCs/>
         </w:rPr>
+        <w:t xml:space="preserve">both</w:t>
+      </w:r>
+      <w:r>
+        <w:t xml:space="preserve"> </w:t>
+      </w:r>
+      <w:r>
+        <w:t xml:space="preserve">classes. An interactive user must exist in</w:t>
+      </w:r>
+      <w:r>
+        <w:t xml:space="preserve"> </w:t>
+      </w:r>
+      <w:r>
+        <w:rPr>
+          <w:rStyle w:val="VerbatimChar"/>
+        </w:rPr>
+        <w:t xml:space="preserve">Location.AppUser</w:t>
+      </w:r>
+      <w:r>
+        <w:t xml:space="preserve"> </w:t>
+      </w:r>
+      <w:r>
+        <w:t xml:space="preserve">for elevation to resolve their account at all, and may also step onto the floor and sign in at a terminal, so a universal PIN removes any operator-vs-interactive branching from the sign-in path.</w:t>
+      </w:r>
+    </w:p>
+    <w:p>
+      <w:pPr>
+        <w:pStyle w:val="BodyText"/>
+      </w:pPr>
+      <w:r>
+        <w:t xml:space="preserve">PINs are exactly 5 numeric characters and</w:t>
+      </w:r>
+      <w:r>
+        <w:t xml:space="preserve"> </w:t>
+      </w:r>
+      <w:r>
+        <w:rPr>
+          <w:b/>
+          <w:bCs/>
+        </w:rPr>
+        <w:t xml:space="preserve">leading zeros are significant</w:t>
+      </w:r>
+      <w:r>
+        <w:t xml:space="preserve"> </w:t>
+      </w:r>
+      <w:r>
+        <w:t xml:space="preserve">— a full-time employee’s code is</w:t>
+      </w:r>
+      <w:r>
+        <w:t xml:space="preserve"> </w:t>
+      </w:r>
+      <w:r>
+        <w:rPr>
+          <w:rStyle w:val="VerbatimChar"/>
+        </w:rPr>
+        <w:t xml:space="preserve">04218</w:t>
+      </w:r>
+      <w:r>
+        <w:t xml:space="preserve">, a temp’s is</w:t>
+      </w:r>
+      <w:r>
+        <w:t xml:space="preserve"> </w:t>
+      </w:r>
+      <w:r>
+        <w:rPr>
+          <w:rStyle w:val="VerbatimChar"/>
+        </w:rPr>
+        <w:t xml:space="preserve">40218</w:t>
+      </w:r>
+      <w:r>
+        <w:t xml:space="preserve">. The PIN is therefore stored and transported as a string; any numeric coercion would strip the zero and lock out every full-time employee.</w:t>
+      </w:r>
+    </w:p>
+    <w:p>
+      <w:pPr>
+        <w:pStyle w:val="BodyText"/>
+      </w:pPr>
+      <w:r>
+        <w:t xml:space="preserve">Every event and mutation SHALL stamp</w:t>
+      </w:r>
+      <w:r>
+        <w:t xml:space="preserve"> </w:t>
+      </w:r>
+      <w:r>
+        <w:rPr>
+          <w:rStyle w:val="VerbatimChar"/>
+        </w:rPr>
+        <w:t xml:space="preserve">AppUserId</w:t>
+      </w:r>
+      <w:r>
+        <w:t xml:space="preserve"> </w:t>
+      </w:r>
+      <w:r>
+        <w:t xml:space="preserve">— never free-text initials, PINs or names. Initials and PIN are natural keys used at the UI layer only; the database records the resolved</w:t>
+      </w:r>
+      <w:r>
+        <w:t xml:space="preserve"> </w:t>
+      </w:r>
+      <w:r>
+        <w:rPr>
+          <w:rStyle w:val="VerbatimChar"/>
+        </w:rPr>
+        <w:t xml:space="preserve">AppUserId</w:t>
+      </w:r>
+      <w:r>
+        <w:t xml:space="preserve">. Initials remain the human-readable label shown on screen and in reports; the PIN is only how a person is recognised at a terminal.</w:t>
+      </w:r>
+    </w:p>
+    <w:bookmarkEnd w:id="95"/>
+    <w:bookmarkStart w:id="96" w:name="fds-04-002-operator-pin-capture"/>
+    <w:p>
+      <w:pPr>
+        <w:pStyle w:val="Heading4"/>
+      </w:pPr>
+      <w:r>
+        <w:t xml:space="preserve">FDS-04-002 — Operator PIN Capture</w:t>
+      </w:r>
+    </w:p>
+    <w:p>
+      <w:pPr>
+        <w:pStyle w:val="FirstParagraph"/>
+      </w:pPr>
+      <w:r>
+        <w:t xml:space="preserve">When an operator approaches a shop-floor terminal to perform their first action, the UI SHALL prompt for their 5-digit PIN. The MES SHALL resolve the</w:t>
+      </w:r>
+      <w:r>
+        <w:t xml:space="preserve"> </w:t>
+      </w:r>
+      <w:r>
+        <w:rPr>
+          <w:rStyle w:val="VerbatimChar"/>
+        </w:rPr>
+        <w:t xml:space="preserve">AppUser</w:t>
+      </w:r>
+      <w:r>
+        <w:t xml:space="preserve"> </w:t>
+      </w:r>
+      <w:r>
+        <w:t xml:space="preserve">via</w:t>
+      </w:r>
+      <w:r>
+        <w:t xml:space="preserve"> </w:t>
+      </w:r>
+      <w:r>
+        <w:rPr>
+          <w:rStyle w:val="VerbatimChar"/>
+        </w:rPr>
+        <w:t xml:space="preserve">Location.AppUser_GetActiveByPin</w:t>
+      </w:r>
+      <w:r>
+        <w:t xml:space="preserve"> </w:t>
+      </w:r>
+      <w:r>
+        <w:t xml:space="preserve">and establish an</w:t>
+      </w:r>
+      <w:r>
+        <w:t xml:space="preserve"> </w:t>
+      </w:r>
+      <w:r>
+        <w:rPr>
+          <w:b/>
+          <w:bCs/>
+        </w:rPr>
         <w:t xml:space="preserve">operator presence context</w:t>
       </w:r>
       <w:r>
         <w:t xml:space="preserve"> </w:t>
       </w:r>
       <w:r>
-        <w:t xml:space="preserve">on that terminal’s Perspective session. No password is verified. The presence context SHALL apply to subsequent events until:</w:t>
+        <w:t xml:space="preserve">on that terminal’s Perspective session.</w:t>
+      </w:r>
+    </w:p>
+    <w:p>
+      <w:pPr>
+        <w:pStyle w:val="BodyText"/>
+      </w:pPr>
+      <w:r>
+        <w:t xml:space="preserve">The PIN is an</w:t>
+      </w:r>
+      <w:r>
+        <w:t xml:space="preserve"> </w:t>
+      </w:r>
+      <w:r>
+        <w:rPr>
+          <w:b/>
+          <w:bCs/>
+        </w:rPr>
+        <w:t xml:space="preserve">identifier, not a credential</w:t>
+      </w:r>
+      <w:r>
+        <w:t xml:space="preserve">: it is stored in plaintext, is visible to administrators, is echoed on screen as it is typed, and verifies no secret. It replaces initials as the sign-in key only because MPP already issues PINs internally and operators know them. No password is verified at any point in this flow.</w:t>
+      </w:r>
+    </w:p>
+    <w:p>
+      <w:pPr>
+        <w:pStyle w:val="BodyText"/>
+      </w:pPr>
+      <w:r>
+        <w:t xml:space="preserve">A PIN that resolves to a</w:t>
+      </w:r>
+      <w:r>
+        <w:t xml:space="preserve"> </w:t>
+      </w:r>
+      <w:r>
+        <w:rPr>
+          <w:b/>
+          <w:bCs/>
+        </w:rPr>
+        <w:t xml:space="preserve">deprecated</w:t>
+      </w:r>
+      <w:r>
+        <w:t xml:space="preserve"> </w:t>
+      </w:r>
+      <w:r>
+        <w:t xml:space="preserve">user SHALL be refused with a message directing the operator to a supervisor, and SHALL NOT offer registration — that PIN is already taken. A PIN that resolves to nothing SHALL offer, in order of prominence, re-entry first and new-operator registration second (FDS-04-010).</w:t>
+      </w:r>
+    </w:p>
+    <w:p>
+      <w:pPr>
+        <w:pStyle w:val="BodyText"/>
+      </w:pPr>
+      <w:r>
+        <w:t xml:space="preserve">The presence context SHALL apply to subsequent events until:</w:t>
       </w:r>
     </w:p>
     <w:p>
@@ -18800,7 +19400,7 @@
         </w:numPr>
       </w:pPr>
       <w:r>
-        <w:t xml:space="preserve">another operator enters different initials, or</w:t>
+        <w:t xml:space="preserve">another operator enters a different PIN, or</w:t>
       </w:r>
     </w:p>
     <w:p>
@@ -18975,7 +19575,38 @@
         <w:pStyle w:val="BodyText"/>
       </w:pPr>
       <w:r>
-        <w:t xml:space="preserve">There is no shop-floor-terminal convenience login. An interactive user authorising an elevated action from a shop-floor terminal SHALL enter AD credentials via the elevation prompt described in FDS-04-006. (A badge-scan or RFID-based elevation mechanism is a documented future enhancement aligned with Honda’s RFID-on-labels initiative — see OI-08 addenda — but is not in MVP scope.)</w:t>
+        <w:t xml:space="preserve">PIN sign-in establishes</w:t>
+      </w:r>
+      <w:r>
+        <w:t xml:space="preserve"> </w:t>
+      </w:r>
+      <w:r>
+        <w:rPr>
+          <w:b/>
+          <w:bCs/>
+        </w:rPr>
+        <w:t xml:space="preserve">presence only</w:t>
+      </w:r>
+      <w:r>
+        <w:t xml:space="preserve"> </w:t>
+      </w:r>
+      <w:r>
+        <w:t xml:space="preserve">and grants no privilege — nothing in the runtime reads the signed-in user’s</w:t>
+      </w:r>
+      <w:r>
+        <w:t xml:space="preserve"> </w:t>
+      </w:r>
+      <w:r>
+        <w:rPr>
+          <w:rStyle w:val="VerbatimChar"/>
+        </w:rPr>
+        <w:t xml:space="preserve">IgnitionRole</w:t>
+      </w:r>
+      <w:r>
+        <w:t xml:space="preserve"> </w:t>
+      </w:r>
+      <w:r>
+        <w:t xml:space="preserve">as an authorisation gate. An interactive user authorising an elevated action from a shop-floor terminal SHALL enter AD credentials via the elevation prompt described in FDS-04-006, regardless of whose PIN is currently signed in. A supervisor stepping in to cover an operator’s break therefore signs in with their own PIN like anyone else: a plain presence swap, no elevation, no added permissions. (A badge-scan or RFID-based elevation mechanism is a documented future enhancement aligned with Honda’s RFID-on-labels initiative — see OI-08 addenda — but is not in MVP scope.)</w:t>
       </w:r>
     </w:p>
     <w:bookmarkEnd w:id="98"/>
@@ -19051,13 +19682,25 @@
         <w:rPr>
           <w:rStyle w:val="VerbatimChar"/>
         </w:rPr>
-        <w:t xml:space="preserve">Location.AppUser_GetByInitials</w:t>
-      </w:r>
-      <w:r>
-        <w:t xml:space="preserve"> </w:t>
-      </w:r>
-      <w:r>
-        <w:t xml:space="preserve">proc. If the initials are unknown or resolve to a deprecated user, the MES SHALL block the submission with a clear validation message; it SHALL NOT auto-create users from unknown initials.</w:t>
+        <w:t xml:space="preserve">Location.AppUser_GetActiveByInitials</w:t>
+      </w:r>
+      <w:r>
+        <w:t xml:space="preserve"> </w:t>
+      </w:r>
+      <w:r>
+        <w:t xml:space="preserve">proc (presence resolution at sign-in uses the PIN equivalent,</w:t>
+      </w:r>
+      <w:r>
+        <w:t xml:space="preserve"> </w:t>
+      </w:r>
+      <w:r>
+        <w:rPr>
+          <w:rStyle w:val="VerbatimChar"/>
+        </w:rPr>
+        <w:t xml:space="preserve">Location.AppUser_GetActiveByPin</w:t>
+      </w:r>
+      <w:r>
+        <w:t xml:space="preserve">). If the initials are unknown or resolve to a deprecated user, the MES SHALL block the submission with a clear validation message; it SHALL NOT auto-create users from unknown initials.</w:t>
       </w:r>
     </w:p>
     <w:bookmarkEnd w:id="100"/>
@@ -19782,7 +20425,48 @@
         <w:t xml:space="preserve"> </w:t>
       </w:r>
       <w:r>
-        <w:t xml:space="preserve">rows SHALL be managed by the Configuration Tool (Admin-only screen). MPP has no AD accounts for operators; their rows carry</w:t>
+        <w:t xml:space="preserve">rows SHALL be</w:t>
+      </w:r>
+      <w:r>
+        <w:t xml:space="preserve"> </w:t>
+      </w:r>
+      <w:r>
+        <w:rPr>
+          <w:b/>
+          <w:bCs/>
+        </w:rPr>
+        <w:t xml:space="preserve">self-provisioned at the terminal</w:t>
+      </w:r>
+      <w:r>
+        <w:t xml:space="preserve">. There is no pre-loaded roster: the first time a person enters a PIN the MES does not recognise, the UI SHALL offer — with re-entry as the more prominent option — to register a new operator, capturing the PIN already entered plus initials and display name. The PIN is carried through read-only, so the number a person signs in with is the number stored against them.</w:t>
+      </w:r>
+    </w:p>
+    <w:p>
+      <w:pPr>
+        <w:pStyle w:val="BodyText"/>
+      </w:pPr>
+      <w:r>
+        <w:t xml:space="preserve">Re-entry is deliberately the default action. Under PIN sign-in a single mistyped digit reaches this dialog, and because registration is the only onboarding path, an emphasised</w:t>
+      </w:r>
+      <w:r>
+        <w:t xml:space="preserve"> </w:t>
+      </w:r>
+      <w:r>
+        <w:t xml:space="preserve">“create”</w:t>
+      </w:r>
+      <w:r>
+        <w:t xml:space="preserve"> </w:t>
+      </w:r>
+      <w:r>
+        <w:t xml:space="preserve">button would turn a typo into a duplicate person record.</w:t>
+      </w:r>
+    </w:p>
+    <w:p>
+      <w:pPr>
+        <w:pStyle w:val="BodyText"/>
+      </w:pPr>
+      <w:r>
+        <w:t xml:space="preserve">MPP has no AD accounts for operators; their rows carry</w:t>
       </w:r>
       <w:r>
         <w:t xml:space="preserve"> </w:t>
@@ -19803,10 +20487,90 @@
         <w:rPr>
           <w:rStyle w:val="VerbatimChar"/>
         </w:rPr>
-        <w:t xml:space="preserve">Initials = NOT NULL, UNIQUE</w:t>
-      </w:r>
-      <w:r>
-        <w:t xml:space="preserve">, and no Ignition role. When an operator’s initials would collide with an existing row, the Admin SHALL enter disambiguating initials (e.g., three- or four-character codes). Deprecation follows the standard</w:t>
+        <w:t xml:space="preserve">IgnitionRole = NULL</w:t>
+      </w:r>
+      <w:r>
+        <w:t xml:space="preserve">, and</w:t>
+      </w:r>
+      <w:r>
+        <w:t xml:space="preserve"> </w:t>
+      </w:r>
+      <w:r>
+        <w:rPr>
+          <w:rStyle w:val="VerbatimChar"/>
+        </w:rPr>
+        <w:t xml:space="preserve">Initials</w:t>
+      </w:r>
+      <w:r>
+        <w:t xml:space="preserve"> </w:t>
+      </w:r>
+      <w:r>
+        <w:t xml:space="preserve">/</w:t>
+      </w:r>
+      <w:r>
+        <w:t xml:space="preserve"> </w:t>
+      </w:r>
+      <w:r>
+        <w:rPr>
+          <w:rStyle w:val="VerbatimChar"/>
+        </w:rPr>
+        <w:t xml:space="preserve">Pin</w:t>
+      </w:r>
+      <w:r>
+        <w:t xml:space="preserve"> </w:t>
+      </w:r>
+      <w:r>
+        <w:t xml:space="preserve">both</w:t>
+      </w:r>
+      <w:r>
+        <w:t xml:space="preserve"> </w:t>
+      </w:r>
+      <w:r>
+        <w:rPr>
+          <w:rStyle w:val="VerbatimChar"/>
+        </w:rPr>
+        <w:t xml:space="preserve">NOT NULL, UNIQUE</w:t>
+      </w:r>
+      <w:r>
+        <w:t xml:space="preserve">. When an operator’s initials would collide with an existing row, disambiguating initials SHALL be entered (e.g., three- or four-character codes); a colliding PIN is refused outright, since PINs are unique plant-wide.</w:t>
+      </w:r>
+    </w:p>
+    <w:p>
+      <w:pPr>
+        <w:pStyle w:val="BodyText"/>
+      </w:pPr>
+      <w:r>
+        <w:rPr>
+          <w:rStyle w:val="VerbatimChar"/>
+        </w:rPr>
+        <w:t xml:space="preserve">Pin</w:t>
+      </w:r>
+      <w:r>
+        <w:t xml:space="preserve"> </w:t>
+      </w:r>
+      <w:r>
+        <w:t xml:space="preserve">uniqueness is enforced across the</w:t>
+      </w:r>
+      <w:r>
+        <w:t xml:space="preserve"> </w:t>
+      </w:r>
+      <w:r>
+        <w:rPr>
+          <w:b/>
+          <w:bCs/>
+        </w:rPr>
+        <w:t xml:space="preserve">full row set including deprecated rows</w:t>
+      </w:r>
+      <w:r>
+        <w:t xml:space="preserve">, so a retired person’s PIN is never reissued and historical attribution can never be re-pointed at someone else.</w:t>
+      </w:r>
+    </w:p>
+    <w:p>
+      <w:pPr>
+        <w:pStyle w:val="BodyText"/>
+      </w:pPr>
+      <w:r>
+        <w:t xml:space="preserve">The Configuration Tool (Admin-only screen) remains the place to correct a record, re-issue a PIN, or deprecate a person — not to onboard one. Deprecation follows the standard</w:t>
       </w:r>
       <w:r>
         <w:t xml:space="preserve"> </w:t>
@@ -19833,7 +20597,7 @@
         <w:t xml:space="preserve">AppUserId</w:t>
       </w:r>
       <w:r>
-        <w:t xml:space="preserve">.</w:t>
+        <w:t xml:space="preserve">, and a deprecated person’s PIN is refused at sign-in with a see-a-supervisor message rather than being offered registration.</w:t>
       </w:r>
     </w:p>
     <w:p>

</xml_diff>